<commit_message>
Changes to Kombiplatine THT
</commit_message>
<xml_diff>
--- a/Bauanleitung/Bauanleitung Wortuhr 2025.docx
+++ b/Bauanleitung/Bauanleitung Wortuhr 2025.docx
@@ -4,7 +4,7 @@
   <w:body>
     <w:p>
       <w:pPr>
-        <w:pStyle w:val="Listenabsatz"/>
+        <w:pStyle w:val="ListParagraph"/>
         <w:numPr>
           <w:ilvl w:val="0"/>
           <w:numId w:val="2"/>
@@ -16,14 +16,17 @@
     </w:p>
     <w:p>
       <w:pPr>
-        <w:pStyle w:val="Listenabsatz"/>
+        <w:pStyle w:val="ListParagraph"/>
         <w:numPr>
           <w:ilvl w:val="0"/>
           <w:numId w:val="2"/>
         </w:numPr>
       </w:pPr>
       <w:r>
-        <w:t>Steuerplatinen von klein nach groß bestücken,</w:t>
+        <w:t>Platine</w:t>
+      </w:r>
+      <w:r>
+        <w:t xml:space="preserve"> von klein nach groß bestücken,</w:t>
       </w:r>
       <w:r>
         <w:t xml:space="preserve"> </w:t>
@@ -37,10 +40,12 @@
         <w:t xml:space="preserve"> zuletzt, </w:t>
       </w:r>
       <w:proofErr w:type="spellStart"/>
+      <w:proofErr w:type="gramStart"/>
       <w:r>
         <w:t>Löthilfe</w:t>
       </w:r>
       <w:proofErr w:type="spellEnd"/>
+      <w:proofErr w:type="gramEnd"/>
       <w:r>
         <w:t xml:space="preserve"> um sie gerade zu bekommen?</w:t>
       </w:r>
@@ -53,16 +58,26 @@
     </w:p>
     <w:p>
       <w:pPr>
-        <w:pStyle w:val="Listenabsatz"/>
+        <w:pStyle w:val="ListParagraph"/>
         <w:numPr>
           <w:ilvl w:val="0"/>
           <w:numId w:val="2"/>
         </w:numPr>
       </w:pPr>
-      <w:r>
-        <w:t>LED Streifen passend zuschneiden und zusammenflicken, Endverbinder Anlöten(</w:t>
+      <w:proofErr w:type="gramStart"/>
+      <w:r>
+        <w:t>LED Streifen</w:t>
+      </w:r>
+      <w:proofErr w:type="gramEnd"/>
+      <w:r>
+        <w:t xml:space="preserve"> passend zuschneiden und zusammenflicken, Endverbinder </w:t>
+      </w:r>
+      <w:proofErr w:type="gramStart"/>
+      <w:r>
+        <w:t>Anlöten(</w:t>
       </w:r>
       <w:proofErr w:type="spellStart"/>
+      <w:proofErr w:type="gramEnd"/>
       <w:r>
         <w:t>Löthilfe</w:t>
       </w:r>
@@ -73,19 +88,19 @@
     </w:p>
     <w:p>
       <w:pPr>
-        <w:pStyle w:val="Listenabsatz"/>
+        <w:pStyle w:val="ListParagraph"/>
         <w:numPr>
           <w:ilvl w:val="0"/>
           <w:numId w:val="2"/>
         </w:numPr>
       </w:pPr>
       <w:r>
-        <w:t>Netzteilplatine zusammenlöten, Netzteilspannung messen/anpassen, Rundstecker an Netzkabel löten</w:t>
+        <w:t>Netzteilspannung messen/anpassen, Rundstecker an Netzkabel löten</w:t>
       </w:r>
     </w:p>
     <w:p>
       <w:pPr>
-        <w:pStyle w:val="Listenabsatz"/>
+        <w:pStyle w:val="ListParagraph"/>
         <w:numPr>
           <w:ilvl w:val="0"/>
           <w:numId w:val="2"/>
@@ -108,7 +123,7 @@
     </w:p>
     <w:p>
       <w:pPr>
-        <w:pStyle w:val="Listenabsatz"/>
+        <w:pStyle w:val="ListParagraph"/>
         <w:numPr>
           <w:ilvl w:val="0"/>
           <w:numId w:val="2"/>
@@ -120,7 +135,7 @@
     </w:p>
     <w:p>
       <w:pPr>
-        <w:pStyle w:val="Listenabsatz"/>
+        <w:pStyle w:val="ListParagraph"/>
         <w:numPr>
           <w:ilvl w:val="0"/>
           <w:numId w:val="2"/>
@@ -141,7 +156,7 @@
     </w:p>
     <w:p>
       <w:pPr>
-        <w:pStyle w:val="Listenabsatz"/>
+        <w:pStyle w:val="ListParagraph"/>
         <w:numPr>
           <w:ilvl w:val="0"/>
           <w:numId w:val="2"/>
@@ -153,7 +168,7 @@
     </w:p>
     <w:p>
       <w:pPr>
-        <w:pStyle w:val="Listenabsatz"/>
+        <w:pStyle w:val="ListParagraph"/>
         <w:numPr>
           <w:ilvl w:val="0"/>
           <w:numId w:val="2"/>
@@ -183,18 +198,17 @@
     <w:p/>
     <w:p>
       <w:pPr>
-        <w:pStyle w:val="Listenabsatz"/>
+        <w:pStyle w:val="ListParagraph"/>
         <w:ind w:left="1080"/>
       </w:pPr>
       <w:r>
         <w:rPr>
           <w:noProof/>
         </w:rPr>
-        <w:lastRenderedPageBreak/>
         <mc:AlternateContent>
           <mc:Choice Requires="wpg">
             <w:drawing>
-              <wp:anchor distT="0" distB="0" distL="114300" distR="114300" simplePos="0" relativeHeight="251660288" behindDoc="1" locked="0" layoutInCell="1" allowOverlap="1" wp14:anchorId="3DA4633F" wp14:editId="1F711D66">
+              <wp:anchor distT="0" distB="0" distL="114300" distR="114300" simplePos="0" relativeHeight="251660288" behindDoc="1" locked="0" layoutInCell="1" allowOverlap="1" wp14:anchorId="3DA4633F" wp14:editId="664F1DC8">
                 <wp:simplePos x="0" y="0"/>
                 <wp:positionH relativeFrom="margin">
                   <wp:align>right</wp:align>
@@ -373,7 +387,7 @@
     </w:p>
     <w:p>
       <w:pPr>
-        <w:pStyle w:val="Listenabsatz"/>
+        <w:pStyle w:val="ListParagraph"/>
         <w:ind w:left="1080"/>
       </w:pPr>
       <w:r>
@@ -1029,15 +1043,15 @@
     <w:lsdException w:name="Unresolved Mention" w:semiHidden="1" w:unhideWhenUsed="1"/>
     <w:lsdException w:name="Smart Link" w:semiHidden="1" w:unhideWhenUsed="1"/>
   </w:latentStyles>
-  <w:style w:type="paragraph" w:default="1" w:styleId="Standard">
+  <w:style w:type="paragraph" w:default="1" w:styleId="Normal">
     <w:name w:val="Normal"/>
     <w:qFormat/>
   </w:style>
-  <w:style w:type="paragraph" w:styleId="berschrift1">
+  <w:style w:type="paragraph" w:styleId="Heading1">
     <w:name w:val="heading 1"/>
-    <w:basedOn w:val="Standard"/>
-    <w:next w:val="Standard"/>
-    <w:link w:val="berschrift1Zchn"/>
+    <w:basedOn w:val="Normal"/>
+    <w:next w:val="Normal"/>
+    <w:link w:val="Heading1Char"/>
     <w:uiPriority w:val="9"/>
     <w:qFormat/>
     <w:rsid w:val="00F91686"/>
@@ -1054,11 +1068,11 @@
       <w:szCs w:val="40"/>
     </w:rPr>
   </w:style>
-  <w:style w:type="paragraph" w:styleId="berschrift2">
+  <w:style w:type="paragraph" w:styleId="Heading2">
     <w:name w:val="heading 2"/>
-    <w:basedOn w:val="Standard"/>
-    <w:next w:val="Standard"/>
-    <w:link w:val="berschrift2Zchn"/>
+    <w:basedOn w:val="Normal"/>
+    <w:next w:val="Normal"/>
+    <w:link w:val="Heading2Char"/>
     <w:uiPriority w:val="9"/>
     <w:semiHidden/>
     <w:unhideWhenUsed/>
@@ -1077,11 +1091,11 @@
       <w:szCs w:val="32"/>
     </w:rPr>
   </w:style>
-  <w:style w:type="paragraph" w:styleId="berschrift3">
+  <w:style w:type="paragraph" w:styleId="Heading3">
     <w:name w:val="heading 3"/>
-    <w:basedOn w:val="Standard"/>
-    <w:next w:val="Standard"/>
-    <w:link w:val="berschrift3Zchn"/>
+    <w:basedOn w:val="Normal"/>
+    <w:next w:val="Normal"/>
+    <w:link w:val="Heading3Char"/>
     <w:uiPriority w:val="9"/>
     <w:semiHidden/>
     <w:unhideWhenUsed/>
@@ -1100,11 +1114,11 @@
       <w:szCs w:val="28"/>
     </w:rPr>
   </w:style>
-  <w:style w:type="paragraph" w:styleId="berschrift4">
+  <w:style w:type="paragraph" w:styleId="Heading4">
     <w:name w:val="heading 4"/>
-    <w:basedOn w:val="Standard"/>
-    <w:next w:val="Standard"/>
-    <w:link w:val="berschrift4Zchn"/>
+    <w:basedOn w:val="Normal"/>
+    <w:next w:val="Normal"/>
+    <w:link w:val="Heading4Char"/>
     <w:uiPriority w:val="9"/>
     <w:semiHidden/>
     <w:unhideWhenUsed/>
@@ -1123,11 +1137,11 @@
       <w:color w:val="0F4761" w:themeColor="accent1" w:themeShade="BF"/>
     </w:rPr>
   </w:style>
-  <w:style w:type="paragraph" w:styleId="berschrift5">
+  <w:style w:type="paragraph" w:styleId="Heading5">
     <w:name w:val="heading 5"/>
-    <w:basedOn w:val="Standard"/>
-    <w:next w:val="Standard"/>
-    <w:link w:val="berschrift5Zchn"/>
+    <w:basedOn w:val="Normal"/>
+    <w:next w:val="Normal"/>
+    <w:link w:val="Heading5Char"/>
     <w:uiPriority w:val="9"/>
     <w:semiHidden/>
     <w:unhideWhenUsed/>
@@ -1144,11 +1158,11 @@
       <w:color w:val="0F4761" w:themeColor="accent1" w:themeShade="BF"/>
     </w:rPr>
   </w:style>
-  <w:style w:type="paragraph" w:styleId="berschrift6">
+  <w:style w:type="paragraph" w:styleId="Heading6">
     <w:name w:val="heading 6"/>
-    <w:basedOn w:val="Standard"/>
-    <w:next w:val="Standard"/>
-    <w:link w:val="berschrift6Zchn"/>
+    <w:basedOn w:val="Normal"/>
+    <w:next w:val="Normal"/>
+    <w:link w:val="Heading6Char"/>
     <w:uiPriority w:val="9"/>
     <w:semiHidden/>
     <w:unhideWhenUsed/>
@@ -1167,11 +1181,11 @@
       <w:color w:val="595959" w:themeColor="text1" w:themeTint="A6"/>
     </w:rPr>
   </w:style>
-  <w:style w:type="paragraph" w:styleId="berschrift7">
+  <w:style w:type="paragraph" w:styleId="Heading7">
     <w:name w:val="heading 7"/>
-    <w:basedOn w:val="Standard"/>
-    <w:next w:val="Standard"/>
-    <w:link w:val="berschrift7Zchn"/>
+    <w:basedOn w:val="Normal"/>
+    <w:next w:val="Normal"/>
+    <w:link w:val="Heading7Char"/>
     <w:uiPriority w:val="9"/>
     <w:semiHidden/>
     <w:unhideWhenUsed/>
@@ -1188,11 +1202,11 @@
       <w:color w:val="595959" w:themeColor="text1" w:themeTint="A6"/>
     </w:rPr>
   </w:style>
-  <w:style w:type="paragraph" w:styleId="berschrift8">
+  <w:style w:type="paragraph" w:styleId="Heading8">
     <w:name w:val="heading 8"/>
-    <w:basedOn w:val="Standard"/>
-    <w:next w:val="Standard"/>
-    <w:link w:val="berschrift8Zchn"/>
+    <w:basedOn w:val="Normal"/>
+    <w:next w:val="Normal"/>
+    <w:link w:val="Heading8Char"/>
     <w:uiPriority w:val="9"/>
     <w:semiHidden/>
     <w:unhideWhenUsed/>
@@ -1211,11 +1225,11 @@
       <w:color w:val="272727" w:themeColor="text1" w:themeTint="D8"/>
     </w:rPr>
   </w:style>
-  <w:style w:type="paragraph" w:styleId="berschrift9">
+  <w:style w:type="paragraph" w:styleId="Heading9">
     <w:name w:val="heading 9"/>
-    <w:basedOn w:val="Standard"/>
-    <w:next w:val="Standard"/>
-    <w:link w:val="berschrift9Zchn"/>
+    <w:basedOn w:val="Normal"/>
+    <w:next w:val="Normal"/>
+    <w:link w:val="Heading9Char"/>
     <w:uiPriority w:val="9"/>
     <w:semiHidden/>
     <w:unhideWhenUsed/>
@@ -1232,13 +1246,13 @@
       <w:color w:val="272727" w:themeColor="text1" w:themeTint="D8"/>
     </w:rPr>
   </w:style>
-  <w:style w:type="character" w:default="1" w:styleId="Absatz-Standardschriftart">
+  <w:style w:type="character" w:default="1" w:styleId="DefaultParagraphFont">
     <w:name w:val="Default Paragraph Font"/>
     <w:uiPriority w:val="1"/>
     <w:semiHidden/>
     <w:unhideWhenUsed/>
   </w:style>
-  <w:style w:type="table" w:default="1" w:styleId="NormaleTabelle">
+  <w:style w:type="table" w:default="1" w:styleId="TableNormal">
     <w:name w:val="Normal Table"/>
     <w:uiPriority w:val="99"/>
     <w:semiHidden/>
@@ -1253,16 +1267,16 @@
       </w:tblCellMar>
     </w:tblPr>
   </w:style>
-  <w:style w:type="numbering" w:default="1" w:styleId="KeineListe">
+  <w:style w:type="numbering" w:default="1" w:styleId="NoList">
     <w:name w:val="No List"/>
     <w:uiPriority w:val="99"/>
     <w:semiHidden/>
     <w:unhideWhenUsed/>
   </w:style>
-  <w:style w:type="character" w:customStyle="1" w:styleId="berschrift1Zchn">
-    <w:name w:val="Überschrift 1 Zchn"/>
-    <w:basedOn w:val="Absatz-Standardschriftart"/>
-    <w:link w:val="berschrift1"/>
+  <w:style w:type="character" w:customStyle="1" w:styleId="Heading1Char">
+    <w:name w:val="Heading 1 Char"/>
+    <w:basedOn w:val="DefaultParagraphFont"/>
+    <w:link w:val="Heading1"/>
     <w:uiPriority w:val="9"/>
     <w:rsid w:val="00F91686"/>
     <w:rPr>
@@ -1272,10 +1286,10 @@
       <w:szCs w:val="40"/>
     </w:rPr>
   </w:style>
-  <w:style w:type="character" w:customStyle="1" w:styleId="berschrift2Zchn">
-    <w:name w:val="Überschrift 2 Zchn"/>
-    <w:basedOn w:val="Absatz-Standardschriftart"/>
-    <w:link w:val="berschrift2"/>
+  <w:style w:type="character" w:customStyle="1" w:styleId="Heading2Char">
+    <w:name w:val="Heading 2 Char"/>
+    <w:basedOn w:val="DefaultParagraphFont"/>
+    <w:link w:val="Heading2"/>
     <w:uiPriority w:val="9"/>
     <w:semiHidden/>
     <w:rsid w:val="00F91686"/>
@@ -1286,10 +1300,10 @@
       <w:szCs w:val="32"/>
     </w:rPr>
   </w:style>
-  <w:style w:type="character" w:customStyle="1" w:styleId="berschrift3Zchn">
-    <w:name w:val="Überschrift 3 Zchn"/>
-    <w:basedOn w:val="Absatz-Standardschriftart"/>
-    <w:link w:val="berschrift3"/>
+  <w:style w:type="character" w:customStyle="1" w:styleId="Heading3Char">
+    <w:name w:val="Heading 3 Char"/>
+    <w:basedOn w:val="DefaultParagraphFont"/>
+    <w:link w:val="Heading3"/>
     <w:uiPriority w:val="9"/>
     <w:semiHidden/>
     <w:rsid w:val="00F91686"/>
@@ -1300,10 +1314,10 @@
       <w:szCs w:val="28"/>
     </w:rPr>
   </w:style>
-  <w:style w:type="character" w:customStyle="1" w:styleId="berschrift4Zchn">
-    <w:name w:val="Überschrift 4 Zchn"/>
-    <w:basedOn w:val="Absatz-Standardschriftart"/>
-    <w:link w:val="berschrift4"/>
+  <w:style w:type="character" w:customStyle="1" w:styleId="Heading4Char">
+    <w:name w:val="Heading 4 Char"/>
+    <w:basedOn w:val="DefaultParagraphFont"/>
+    <w:link w:val="Heading4"/>
     <w:uiPriority w:val="9"/>
     <w:semiHidden/>
     <w:rsid w:val="00F91686"/>
@@ -1314,10 +1328,10 @@
       <w:color w:val="0F4761" w:themeColor="accent1" w:themeShade="BF"/>
     </w:rPr>
   </w:style>
-  <w:style w:type="character" w:customStyle="1" w:styleId="berschrift5Zchn">
-    <w:name w:val="Überschrift 5 Zchn"/>
-    <w:basedOn w:val="Absatz-Standardschriftart"/>
-    <w:link w:val="berschrift5"/>
+  <w:style w:type="character" w:customStyle="1" w:styleId="Heading5Char">
+    <w:name w:val="Heading 5 Char"/>
+    <w:basedOn w:val="DefaultParagraphFont"/>
+    <w:link w:val="Heading5"/>
     <w:uiPriority w:val="9"/>
     <w:semiHidden/>
     <w:rsid w:val="00F91686"/>
@@ -1326,10 +1340,10 @@
       <w:color w:val="0F4761" w:themeColor="accent1" w:themeShade="BF"/>
     </w:rPr>
   </w:style>
-  <w:style w:type="character" w:customStyle="1" w:styleId="berschrift6Zchn">
-    <w:name w:val="Überschrift 6 Zchn"/>
-    <w:basedOn w:val="Absatz-Standardschriftart"/>
-    <w:link w:val="berschrift6"/>
+  <w:style w:type="character" w:customStyle="1" w:styleId="Heading6Char">
+    <w:name w:val="Heading 6 Char"/>
+    <w:basedOn w:val="DefaultParagraphFont"/>
+    <w:link w:val="Heading6"/>
     <w:uiPriority w:val="9"/>
     <w:semiHidden/>
     <w:rsid w:val="00F91686"/>
@@ -1340,10 +1354,10 @@
       <w:color w:val="595959" w:themeColor="text1" w:themeTint="A6"/>
     </w:rPr>
   </w:style>
-  <w:style w:type="character" w:customStyle="1" w:styleId="berschrift7Zchn">
-    <w:name w:val="Überschrift 7 Zchn"/>
-    <w:basedOn w:val="Absatz-Standardschriftart"/>
-    <w:link w:val="berschrift7"/>
+  <w:style w:type="character" w:customStyle="1" w:styleId="Heading7Char">
+    <w:name w:val="Heading 7 Char"/>
+    <w:basedOn w:val="DefaultParagraphFont"/>
+    <w:link w:val="Heading7"/>
     <w:uiPriority w:val="9"/>
     <w:semiHidden/>
     <w:rsid w:val="00F91686"/>
@@ -1352,10 +1366,10 @@
       <w:color w:val="595959" w:themeColor="text1" w:themeTint="A6"/>
     </w:rPr>
   </w:style>
-  <w:style w:type="character" w:customStyle="1" w:styleId="berschrift8Zchn">
-    <w:name w:val="Überschrift 8 Zchn"/>
-    <w:basedOn w:val="Absatz-Standardschriftart"/>
-    <w:link w:val="berschrift8"/>
+  <w:style w:type="character" w:customStyle="1" w:styleId="Heading8Char">
+    <w:name w:val="Heading 8 Char"/>
+    <w:basedOn w:val="DefaultParagraphFont"/>
+    <w:link w:val="Heading8"/>
     <w:uiPriority w:val="9"/>
     <w:semiHidden/>
     <w:rsid w:val="00F91686"/>
@@ -1366,10 +1380,10 @@
       <w:color w:val="272727" w:themeColor="text1" w:themeTint="D8"/>
     </w:rPr>
   </w:style>
-  <w:style w:type="character" w:customStyle="1" w:styleId="berschrift9Zchn">
-    <w:name w:val="Überschrift 9 Zchn"/>
-    <w:basedOn w:val="Absatz-Standardschriftart"/>
-    <w:link w:val="berschrift9"/>
+  <w:style w:type="character" w:customStyle="1" w:styleId="Heading9Char">
+    <w:name w:val="Heading 9 Char"/>
+    <w:basedOn w:val="DefaultParagraphFont"/>
+    <w:link w:val="Heading9"/>
     <w:uiPriority w:val="9"/>
     <w:semiHidden/>
     <w:rsid w:val="00F91686"/>
@@ -1378,11 +1392,11 @@
       <w:color w:val="272727" w:themeColor="text1" w:themeTint="D8"/>
     </w:rPr>
   </w:style>
-  <w:style w:type="paragraph" w:styleId="Titel">
+  <w:style w:type="paragraph" w:styleId="Title">
     <w:name w:val="Title"/>
-    <w:basedOn w:val="Standard"/>
-    <w:next w:val="Standard"/>
-    <w:link w:val="TitelZchn"/>
+    <w:basedOn w:val="Normal"/>
+    <w:next w:val="Normal"/>
+    <w:link w:val="TitleChar"/>
     <w:uiPriority w:val="10"/>
     <w:qFormat/>
     <w:rsid w:val="00F91686"/>
@@ -1398,10 +1412,10 @@
       <w:szCs w:val="56"/>
     </w:rPr>
   </w:style>
-  <w:style w:type="character" w:customStyle="1" w:styleId="TitelZchn">
-    <w:name w:val="Titel Zchn"/>
-    <w:basedOn w:val="Absatz-Standardschriftart"/>
-    <w:link w:val="Titel"/>
+  <w:style w:type="character" w:customStyle="1" w:styleId="TitleChar">
+    <w:name w:val="Title Char"/>
+    <w:basedOn w:val="DefaultParagraphFont"/>
+    <w:link w:val="Title"/>
     <w:uiPriority w:val="10"/>
     <w:rsid w:val="00F91686"/>
     <w:rPr>
@@ -1412,11 +1426,11 @@
       <w:szCs w:val="56"/>
     </w:rPr>
   </w:style>
-  <w:style w:type="paragraph" w:styleId="Untertitel">
+  <w:style w:type="paragraph" w:styleId="Subtitle">
     <w:name w:val="Subtitle"/>
-    <w:basedOn w:val="Standard"/>
-    <w:next w:val="Standard"/>
-    <w:link w:val="UntertitelZchn"/>
+    <w:basedOn w:val="Normal"/>
+    <w:next w:val="Normal"/>
+    <w:link w:val="SubtitleChar"/>
     <w:uiPriority w:val="11"/>
     <w:qFormat/>
     <w:rsid w:val="00F91686"/>
@@ -1433,10 +1447,10 @@
       <w:szCs w:val="28"/>
     </w:rPr>
   </w:style>
-  <w:style w:type="character" w:customStyle="1" w:styleId="UntertitelZchn">
-    <w:name w:val="Untertitel Zchn"/>
-    <w:basedOn w:val="Absatz-Standardschriftart"/>
-    <w:link w:val="Untertitel"/>
+  <w:style w:type="character" w:customStyle="1" w:styleId="SubtitleChar">
+    <w:name w:val="Subtitle Char"/>
+    <w:basedOn w:val="DefaultParagraphFont"/>
+    <w:link w:val="Subtitle"/>
     <w:uiPriority w:val="11"/>
     <w:rsid w:val="00F91686"/>
     <w:rPr>
@@ -1447,11 +1461,11 @@
       <w:szCs w:val="28"/>
     </w:rPr>
   </w:style>
-  <w:style w:type="paragraph" w:styleId="Zitat">
+  <w:style w:type="paragraph" w:styleId="Quote">
     <w:name w:val="Quote"/>
-    <w:basedOn w:val="Standard"/>
-    <w:next w:val="Standard"/>
-    <w:link w:val="ZitatZchn"/>
+    <w:basedOn w:val="Normal"/>
+    <w:next w:val="Normal"/>
+    <w:link w:val="QuoteChar"/>
     <w:uiPriority w:val="29"/>
     <w:qFormat/>
     <w:rsid w:val="00F91686"/>
@@ -1465,10 +1479,10 @@
       <w:color w:val="404040" w:themeColor="text1" w:themeTint="BF"/>
     </w:rPr>
   </w:style>
-  <w:style w:type="character" w:customStyle="1" w:styleId="ZitatZchn">
-    <w:name w:val="Zitat Zchn"/>
-    <w:basedOn w:val="Absatz-Standardschriftart"/>
-    <w:link w:val="Zitat"/>
+  <w:style w:type="character" w:customStyle="1" w:styleId="QuoteChar">
+    <w:name w:val="Quote Char"/>
+    <w:basedOn w:val="DefaultParagraphFont"/>
+    <w:link w:val="Quote"/>
     <w:uiPriority w:val="29"/>
     <w:rsid w:val="00F91686"/>
     <w:rPr>
@@ -1477,9 +1491,9 @@
       <w:color w:val="404040" w:themeColor="text1" w:themeTint="BF"/>
     </w:rPr>
   </w:style>
-  <w:style w:type="paragraph" w:styleId="Listenabsatz">
+  <w:style w:type="paragraph" w:styleId="ListParagraph">
     <w:name w:val="List Paragraph"/>
-    <w:basedOn w:val="Standard"/>
+    <w:basedOn w:val="Normal"/>
     <w:uiPriority w:val="34"/>
     <w:qFormat/>
     <w:rsid w:val="00F91686"/>
@@ -1488,9 +1502,9 @@
       <w:contextualSpacing/>
     </w:pPr>
   </w:style>
-  <w:style w:type="character" w:styleId="IntensiveHervorhebung">
+  <w:style w:type="character" w:styleId="IntenseEmphasis">
     <w:name w:val="Intense Emphasis"/>
-    <w:basedOn w:val="Absatz-Standardschriftart"/>
+    <w:basedOn w:val="DefaultParagraphFont"/>
     <w:uiPriority w:val="21"/>
     <w:qFormat/>
     <w:rsid w:val="00F91686"/>
@@ -1500,11 +1514,11 @@
       <w:color w:val="0F4761" w:themeColor="accent1" w:themeShade="BF"/>
     </w:rPr>
   </w:style>
-  <w:style w:type="paragraph" w:styleId="IntensivesZitat">
+  <w:style w:type="paragraph" w:styleId="IntenseQuote">
     <w:name w:val="Intense Quote"/>
-    <w:basedOn w:val="Standard"/>
-    <w:next w:val="Standard"/>
-    <w:link w:val="IntensivesZitatZchn"/>
+    <w:basedOn w:val="Normal"/>
+    <w:next w:val="Normal"/>
+    <w:link w:val="IntenseQuoteChar"/>
     <w:uiPriority w:val="30"/>
     <w:qFormat/>
     <w:rsid w:val="00F91686"/>
@@ -1523,10 +1537,10 @@
       <w:color w:val="0F4761" w:themeColor="accent1" w:themeShade="BF"/>
     </w:rPr>
   </w:style>
-  <w:style w:type="character" w:customStyle="1" w:styleId="IntensivesZitatZchn">
-    <w:name w:val="Intensives Zitat Zchn"/>
-    <w:basedOn w:val="Absatz-Standardschriftart"/>
-    <w:link w:val="IntensivesZitat"/>
+  <w:style w:type="character" w:customStyle="1" w:styleId="IntenseQuoteChar">
+    <w:name w:val="Intense Quote Char"/>
+    <w:basedOn w:val="DefaultParagraphFont"/>
+    <w:link w:val="IntenseQuote"/>
     <w:uiPriority w:val="30"/>
     <w:rsid w:val="00F91686"/>
     <w:rPr>
@@ -1535,9 +1549,9 @@
       <w:color w:val="0F4761" w:themeColor="accent1" w:themeShade="BF"/>
     </w:rPr>
   </w:style>
-  <w:style w:type="character" w:styleId="IntensiverVerweis">
+  <w:style w:type="character" w:styleId="IntenseReference">
     <w:name w:val="Intense Reference"/>
-    <w:basedOn w:val="Absatz-Standardschriftart"/>
+    <w:basedOn w:val="DefaultParagraphFont"/>
     <w:uiPriority w:val="32"/>
     <w:qFormat/>
     <w:rsid w:val="00F91686"/>
@@ -1549,10 +1563,10 @@
       <w:spacing w:val="5"/>
     </w:rPr>
   </w:style>
-  <w:style w:type="paragraph" w:styleId="Kopfzeile">
+  <w:style w:type="paragraph" w:styleId="Header">
     <w:name w:val="header"/>
-    <w:basedOn w:val="Standard"/>
-    <w:link w:val="KopfzeileZchn"/>
+    <w:basedOn w:val="Normal"/>
+    <w:link w:val="HeaderChar"/>
     <w:uiPriority w:val="99"/>
     <w:unhideWhenUsed/>
     <w:rsid w:val="006A690B"/>
@@ -1564,17 +1578,17 @@
       <w:spacing w:after="0" w:line="240" w:lineRule="auto"/>
     </w:pPr>
   </w:style>
-  <w:style w:type="character" w:customStyle="1" w:styleId="KopfzeileZchn">
-    <w:name w:val="Kopfzeile Zchn"/>
-    <w:basedOn w:val="Absatz-Standardschriftart"/>
-    <w:link w:val="Kopfzeile"/>
+  <w:style w:type="character" w:customStyle="1" w:styleId="HeaderChar">
+    <w:name w:val="Header Char"/>
+    <w:basedOn w:val="DefaultParagraphFont"/>
+    <w:link w:val="Header"/>
     <w:uiPriority w:val="99"/>
     <w:rsid w:val="006A690B"/>
   </w:style>
-  <w:style w:type="paragraph" w:styleId="Fuzeile">
+  <w:style w:type="paragraph" w:styleId="Footer">
     <w:name w:val="footer"/>
-    <w:basedOn w:val="Standard"/>
-    <w:link w:val="FuzeileZchn"/>
+    <w:basedOn w:val="Normal"/>
+    <w:link w:val="FooterChar"/>
     <w:uiPriority w:val="99"/>
     <w:unhideWhenUsed/>
     <w:rsid w:val="006A690B"/>
@@ -1586,10 +1600,10 @@
       <w:spacing w:after="0" w:line="240" w:lineRule="auto"/>
     </w:pPr>
   </w:style>
-  <w:style w:type="character" w:customStyle="1" w:styleId="FuzeileZchn">
-    <w:name w:val="Fußzeile Zchn"/>
-    <w:basedOn w:val="Absatz-Standardschriftart"/>
-    <w:link w:val="Fuzeile"/>
+  <w:style w:type="character" w:customStyle="1" w:styleId="FooterChar">
+    <w:name w:val="Footer Char"/>
+    <w:basedOn w:val="DefaultParagraphFont"/>
+    <w:link w:val="Footer"/>
     <w:uiPriority w:val="99"/>
     <w:rsid w:val="006A690B"/>
   </w:style>

</xml_diff>

<commit_message>
Merged major changes for this years wordclock (#5)
* Combied pcbs, added smd version

* Implement some of the changes requested in issue 1

* Changes to Kombiplatine THT

---------

Co-authored-by: Marek Wehning <marek.wehning@inlight-gmbh.de>
</commit_message>
<xml_diff>
--- a/Bauanleitung/Bauanleitung Wortuhr 2025.docx
+++ b/Bauanleitung/Bauanleitung Wortuhr 2025.docx
@@ -4,7 +4,7 @@
   <w:body>
     <w:p>
       <w:pPr>
-        <w:pStyle w:val="Listenabsatz"/>
+        <w:pStyle w:val="ListParagraph"/>
         <w:numPr>
           <w:ilvl w:val="0"/>
           <w:numId w:val="2"/>
@@ -16,14 +16,17 @@
     </w:p>
     <w:p>
       <w:pPr>
-        <w:pStyle w:val="Listenabsatz"/>
+        <w:pStyle w:val="ListParagraph"/>
         <w:numPr>
           <w:ilvl w:val="0"/>
           <w:numId w:val="2"/>
         </w:numPr>
       </w:pPr>
       <w:r>
-        <w:t>Steuerplatinen von klein nach groß bestücken,</w:t>
+        <w:t>Platine</w:t>
+      </w:r>
+      <w:r>
+        <w:t xml:space="preserve"> von klein nach groß bestücken,</w:t>
       </w:r>
       <w:r>
         <w:t xml:space="preserve"> </w:t>
@@ -37,10 +40,12 @@
         <w:t xml:space="preserve"> zuletzt, </w:t>
       </w:r>
       <w:proofErr w:type="spellStart"/>
+      <w:proofErr w:type="gramStart"/>
       <w:r>
         <w:t>Löthilfe</w:t>
       </w:r>
       <w:proofErr w:type="spellEnd"/>
+      <w:proofErr w:type="gramEnd"/>
       <w:r>
         <w:t xml:space="preserve"> um sie gerade zu bekommen?</w:t>
       </w:r>
@@ -53,16 +58,26 @@
     </w:p>
     <w:p>
       <w:pPr>
-        <w:pStyle w:val="Listenabsatz"/>
+        <w:pStyle w:val="ListParagraph"/>
         <w:numPr>
           <w:ilvl w:val="0"/>
           <w:numId w:val="2"/>
         </w:numPr>
       </w:pPr>
-      <w:r>
-        <w:t>LED Streifen passend zuschneiden und zusammenflicken, Endverbinder Anlöten(</w:t>
+      <w:proofErr w:type="gramStart"/>
+      <w:r>
+        <w:t>LED Streifen</w:t>
+      </w:r>
+      <w:proofErr w:type="gramEnd"/>
+      <w:r>
+        <w:t xml:space="preserve"> passend zuschneiden und zusammenflicken, Endverbinder </w:t>
+      </w:r>
+      <w:proofErr w:type="gramStart"/>
+      <w:r>
+        <w:t>Anlöten(</w:t>
       </w:r>
       <w:proofErr w:type="spellStart"/>
+      <w:proofErr w:type="gramEnd"/>
       <w:r>
         <w:t>Löthilfe</w:t>
       </w:r>
@@ -73,19 +88,19 @@
     </w:p>
     <w:p>
       <w:pPr>
-        <w:pStyle w:val="Listenabsatz"/>
+        <w:pStyle w:val="ListParagraph"/>
         <w:numPr>
           <w:ilvl w:val="0"/>
           <w:numId w:val="2"/>
         </w:numPr>
       </w:pPr>
       <w:r>
-        <w:t>Netzteilplatine zusammenlöten, Netzteilspannung messen/anpassen, Rundstecker an Netzkabel löten</w:t>
+        <w:t>Netzteilspannung messen/anpassen, Rundstecker an Netzkabel löten</w:t>
       </w:r>
     </w:p>
     <w:p>
       <w:pPr>
-        <w:pStyle w:val="Listenabsatz"/>
+        <w:pStyle w:val="ListParagraph"/>
         <w:numPr>
           <w:ilvl w:val="0"/>
           <w:numId w:val="2"/>
@@ -108,7 +123,7 @@
     </w:p>
     <w:p>
       <w:pPr>
-        <w:pStyle w:val="Listenabsatz"/>
+        <w:pStyle w:val="ListParagraph"/>
         <w:numPr>
           <w:ilvl w:val="0"/>
           <w:numId w:val="2"/>
@@ -120,7 +135,7 @@
     </w:p>
     <w:p>
       <w:pPr>
-        <w:pStyle w:val="Listenabsatz"/>
+        <w:pStyle w:val="ListParagraph"/>
         <w:numPr>
           <w:ilvl w:val="0"/>
           <w:numId w:val="2"/>
@@ -141,7 +156,7 @@
     </w:p>
     <w:p>
       <w:pPr>
-        <w:pStyle w:val="Listenabsatz"/>
+        <w:pStyle w:val="ListParagraph"/>
         <w:numPr>
           <w:ilvl w:val="0"/>
           <w:numId w:val="2"/>
@@ -153,7 +168,7 @@
     </w:p>
     <w:p>
       <w:pPr>
-        <w:pStyle w:val="Listenabsatz"/>
+        <w:pStyle w:val="ListParagraph"/>
         <w:numPr>
           <w:ilvl w:val="0"/>
           <w:numId w:val="2"/>
@@ -183,18 +198,17 @@
     <w:p/>
     <w:p>
       <w:pPr>
-        <w:pStyle w:val="Listenabsatz"/>
+        <w:pStyle w:val="ListParagraph"/>
         <w:ind w:left="1080"/>
       </w:pPr>
       <w:r>
         <w:rPr>
           <w:noProof/>
         </w:rPr>
-        <w:lastRenderedPageBreak/>
         <mc:AlternateContent>
           <mc:Choice Requires="wpg">
             <w:drawing>
-              <wp:anchor distT="0" distB="0" distL="114300" distR="114300" simplePos="0" relativeHeight="251660288" behindDoc="1" locked="0" layoutInCell="1" allowOverlap="1" wp14:anchorId="3DA4633F" wp14:editId="1F711D66">
+              <wp:anchor distT="0" distB="0" distL="114300" distR="114300" simplePos="0" relativeHeight="251660288" behindDoc="1" locked="0" layoutInCell="1" allowOverlap="1" wp14:anchorId="3DA4633F" wp14:editId="664F1DC8">
                 <wp:simplePos x="0" y="0"/>
                 <wp:positionH relativeFrom="margin">
                   <wp:align>right</wp:align>
@@ -373,7 +387,7 @@
     </w:p>
     <w:p>
       <w:pPr>
-        <w:pStyle w:val="Listenabsatz"/>
+        <w:pStyle w:val="ListParagraph"/>
         <w:ind w:left="1080"/>
       </w:pPr>
       <w:r>
@@ -1029,15 +1043,15 @@
     <w:lsdException w:name="Unresolved Mention" w:semiHidden="1" w:unhideWhenUsed="1"/>
     <w:lsdException w:name="Smart Link" w:semiHidden="1" w:unhideWhenUsed="1"/>
   </w:latentStyles>
-  <w:style w:type="paragraph" w:default="1" w:styleId="Standard">
+  <w:style w:type="paragraph" w:default="1" w:styleId="Normal">
     <w:name w:val="Normal"/>
     <w:qFormat/>
   </w:style>
-  <w:style w:type="paragraph" w:styleId="berschrift1">
+  <w:style w:type="paragraph" w:styleId="Heading1">
     <w:name w:val="heading 1"/>
-    <w:basedOn w:val="Standard"/>
-    <w:next w:val="Standard"/>
-    <w:link w:val="berschrift1Zchn"/>
+    <w:basedOn w:val="Normal"/>
+    <w:next w:val="Normal"/>
+    <w:link w:val="Heading1Char"/>
     <w:uiPriority w:val="9"/>
     <w:qFormat/>
     <w:rsid w:val="00F91686"/>
@@ -1054,11 +1068,11 @@
       <w:szCs w:val="40"/>
     </w:rPr>
   </w:style>
-  <w:style w:type="paragraph" w:styleId="berschrift2">
+  <w:style w:type="paragraph" w:styleId="Heading2">
     <w:name w:val="heading 2"/>
-    <w:basedOn w:val="Standard"/>
-    <w:next w:val="Standard"/>
-    <w:link w:val="berschrift2Zchn"/>
+    <w:basedOn w:val="Normal"/>
+    <w:next w:val="Normal"/>
+    <w:link w:val="Heading2Char"/>
     <w:uiPriority w:val="9"/>
     <w:semiHidden/>
     <w:unhideWhenUsed/>
@@ -1077,11 +1091,11 @@
       <w:szCs w:val="32"/>
     </w:rPr>
   </w:style>
-  <w:style w:type="paragraph" w:styleId="berschrift3">
+  <w:style w:type="paragraph" w:styleId="Heading3">
     <w:name w:val="heading 3"/>
-    <w:basedOn w:val="Standard"/>
-    <w:next w:val="Standard"/>
-    <w:link w:val="berschrift3Zchn"/>
+    <w:basedOn w:val="Normal"/>
+    <w:next w:val="Normal"/>
+    <w:link w:val="Heading3Char"/>
     <w:uiPriority w:val="9"/>
     <w:semiHidden/>
     <w:unhideWhenUsed/>
@@ -1100,11 +1114,11 @@
       <w:szCs w:val="28"/>
     </w:rPr>
   </w:style>
-  <w:style w:type="paragraph" w:styleId="berschrift4">
+  <w:style w:type="paragraph" w:styleId="Heading4">
     <w:name w:val="heading 4"/>
-    <w:basedOn w:val="Standard"/>
-    <w:next w:val="Standard"/>
-    <w:link w:val="berschrift4Zchn"/>
+    <w:basedOn w:val="Normal"/>
+    <w:next w:val="Normal"/>
+    <w:link w:val="Heading4Char"/>
     <w:uiPriority w:val="9"/>
     <w:semiHidden/>
     <w:unhideWhenUsed/>
@@ -1123,11 +1137,11 @@
       <w:color w:val="0F4761" w:themeColor="accent1" w:themeShade="BF"/>
     </w:rPr>
   </w:style>
-  <w:style w:type="paragraph" w:styleId="berschrift5">
+  <w:style w:type="paragraph" w:styleId="Heading5">
     <w:name w:val="heading 5"/>
-    <w:basedOn w:val="Standard"/>
-    <w:next w:val="Standard"/>
-    <w:link w:val="berschrift5Zchn"/>
+    <w:basedOn w:val="Normal"/>
+    <w:next w:val="Normal"/>
+    <w:link w:val="Heading5Char"/>
     <w:uiPriority w:val="9"/>
     <w:semiHidden/>
     <w:unhideWhenUsed/>
@@ -1144,11 +1158,11 @@
       <w:color w:val="0F4761" w:themeColor="accent1" w:themeShade="BF"/>
     </w:rPr>
   </w:style>
-  <w:style w:type="paragraph" w:styleId="berschrift6">
+  <w:style w:type="paragraph" w:styleId="Heading6">
     <w:name w:val="heading 6"/>
-    <w:basedOn w:val="Standard"/>
-    <w:next w:val="Standard"/>
-    <w:link w:val="berschrift6Zchn"/>
+    <w:basedOn w:val="Normal"/>
+    <w:next w:val="Normal"/>
+    <w:link w:val="Heading6Char"/>
     <w:uiPriority w:val="9"/>
     <w:semiHidden/>
     <w:unhideWhenUsed/>
@@ -1167,11 +1181,11 @@
       <w:color w:val="595959" w:themeColor="text1" w:themeTint="A6"/>
     </w:rPr>
   </w:style>
-  <w:style w:type="paragraph" w:styleId="berschrift7">
+  <w:style w:type="paragraph" w:styleId="Heading7">
     <w:name w:val="heading 7"/>
-    <w:basedOn w:val="Standard"/>
-    <w:next w:val="Standard"/>
-    <w:link w:val="berschrift7Zchn"/>
+    <w:basedOn w:val="Normal"/>
+    <w:next w:val="Normal"/>
+    <w:link w:val="Heading7Char"/>
     <w:uiPriority w:val="9"/>
     <w:semiHidden/>
     <w:unhideWhenUsed/>
@@ -1188,11 +1202,11 @@
       <w:color w:val="595959" w:themeColor="text1" w:themeTint="A6"/>
     </w:rPr>
   </w:style>
-  <w:style w:type="paragraph" w:styleId="berschrift8">
+  <w:style w:type="paragraph" w:styleId="Heading8">
     <w:name w:val="heading 8"/>
-    <w:basedOn w:val="Standard"/>
-    <w:next w:val="Standard"/>
-    <w:link w:val="berschrift8Zchn"/>
+    <w:basedOn w:val="Normal"/>
+    <w:next w:val="Normal"/>
+    <w:link w:val="Heading8Char"/>
     <w:uiPriority w:val="9"/>
     <w:semiHidden/>
     <w:unhideWhenUsed/>
@@ -1211,11 +1225,11 @@
       <w:color w:val="272727" w:themeColor="text1" w:themeTint="D8"/>
     </w:rPr>
   </w:style>
-  <w:style w:type="paragraph" w:styleId="berschrift9">
+  <w:style w:type="paragraph" w:styleId="Heading9">
     <w:name w:val="heading 9"/>
-    <w:basedOn w:val="Standard"/>
-    <w:next w:val="Standard"/>
-    <w:link w:val="berschrift9Zchn"/>
+    <w:basedOn w:val="Normal"/>
+    <w:next w:val="Normal"/>
+    <w:link w:val="Heading9Char"/>
     <w:uiPriority w:val="9"/>
     <w:semiHidden/>
     <w:unhideWhenUsed/>
@@ -1232,13 +1246,13 @@
       <w:color w:val="272727" w:themeColor="text1" w:themeTint="D8"/>
     </w:rPr>
   </w:style>
-  <w:style w:type="character" w:default="1" w:styleId="Absatz-Standardschriftart">
+  <w:style w:type="character" w:default="1" w:styleId="DefaultParagraphFont">
     <w:name w:val="Default Paragraph Font"/>
     <w:uiPriority w:val="1"/>
     <w:semiHidden/>
     <w:unhideWhenUsed/>
   </w:style>
-  <w:style w:type="table" w:default="1" w:styleId="NormaleTabelle">
+  <w:style w:type="table" w:default="1" w:styleId="TableNormal">
     <w:name w:val="Normal Table"/>
     <w:uiPriority w:val="99"/>
     <w:semiHidden/>
@@ -1253,16 +1267,16 @@
       </w:tblCellMar>
     </w:tblPr>
   </w:style>
-  <w:style w:type="numbering" w:default="1" w:styleId="KeineListe">
+  <w:style w:type="numbering" w:default="1" w:styleId="NoList">
     <w:name w:val="No List"/>
     <w:uiPriority w:val="99"/>
     <w:semiHidden/>
     <w:unhideWhenUsed/>
   </w:style>
-  <w:style w:type="character" w:customStyle="1" w:styleId="berschrift1Zchn">
-    <w:name w:val="Überschrift 1 Zchn"/>
-    <w:basedOn w:val="Absatz-Standardschriftart"/>
-    <w:link w:val="berschrift1"/>
+  <w:style w:type="character" w:customStyle="1" w:styleId="Heading1Char">
+    <w:name w:val="Heading 1 Char"/>
+    <w:basedOn w:val="DefaultParagraphFont"/>
+    <w:link w:val="Heading1"/>
     <w:uiPriority w:val="9"/>
     <w:rsid w:val="00F91686"/>
     <w:rPr>
@@ -1272,10 +1286,10 @@
       <w:szCs w:val="40"/>
     </w:rPr>
   </w:style>
-  <w:style w:type="character" w:customStyle="1" w:styleId="berschrift2Zchn">
-    <w:name w:val="Überschrift 2 Zchn"/>
-    <w:basedOn w:val="Absatz-Standardschriftart"/>
-    <w:link w:val="berschrift2"/>
+  <w:style w:type="character" w:customStyle="1" w:styleId="Heading2Char">
+    <w:name w:val="Heading 2 Char"/>
+    <w:basedOn w:val="DefaultParagraphFont"/>
+    <w:link w:val="Heading2"/>
     <w:uiPriority w:val="9"/>
     <w:semiHidden/>
     <w:rsid w:val="00F91686"/>
@@ -1286,10 +1300,10 @@
       <w:szCs w:val="32"/>
     </w:rPr>
   </w:style>
-  <w:style w:type="character" w:customStyle="1" w:styleId="berschrift3Zchn">
-    <w:name w:val="Überschrift 3 Zchn"/>
-    <w:basedOn w:val="Absatz-Standardschriftart"/>
-    <w:link w:val="berschrift3"/>
+  <w:style w:type="character" w:customStyle="1" w:styleId="Heading3Char">
+    <w:name w:val="Heading 3 Char"/>
+    <w:basedOn w:val="DefaultParagraphFont"/>
+    <w:link w:val="Heading3"/>
     <w:uiPriority w:val="9"/>
     <w:semiHidden/>
     <w:rsid w:val="00F91686"/>
@@ -1300,10 +1314,10 @@
       <w:szCs w:val="28"/>
     </w:rPr>
   </w:style>
-  <w:style w:type="character" w:customStyle="1" w:styleId="berschrift4Zchn">
-    <w:name w:val="Überschrift 4 Zchn"/>
-    <w:basedOn w:val="Absatz-Standardschriftart"/>
-    <w:link w:val="berschrift4"/>
+  <w:style w:type="character" w:customStyle="1" w:styleId="Heading4Char">
+    <w:name w:val="Heading 4 Char"/>
+    <w:basedOn w:val="DefaultParagraphFont"/>
+    <w:link w:val="Heading4"/>
     <w:uiPriority w:val="9"/>
     <w:semiHidden/>
     <w:rsid w:val="00F91686"/>
@@ -1314,10 +1328,10 @@
       <w:color w:val="0F4761" w:themeColor="accent1" w:themeShade="BF"/>
     </w:rPr>
   </w:style>
-  <w:style w:type="character" w:customStyle="1" w:styleId="berschrift5Zchn">
-    <w:name w:val="Überschrift 5 Zchn"/>
-    <w:basedOn w:val="Absatz-Standardschriftart"/>
-    <w:link w:val="berschrift5"/>
+  <w:style w:type="character" w:customStyle="1" w:styleId="Heading5Char">
+    <w:name w:val="Heading 5 Char"/>
+    <w:basedOn w:val="DefaultParagraphFont"/>
+    <w:link w:val="Heading5"/>
     <w:uiPriority w:val="9"/>
     <w:semiHidden/>
     <w:rsid w:val="00F91686"/>
@@ -1326,10 +1340,10 @@
       <w:color w:val="0F4761" w:themeColor="accent1" w:themeShade="BF"/>
     </w:rPr>
   </w:style>
-  <w:style w:type="character" w:customStyle="1" w:styleId="berschrift6Zchn">
-    <w:name w:val="Überschrift 6 Zchn"/>
-    <w:basedOn w:val="Absatz-Standardschriftart"/>
-    <w:link w:val="berschrift6"/>
+  <w:style w:type="character" w:customStyle="1" w:styleId="Heading6Char">
+    <w:name w:val="Heading 6 Char"/>
+    <w:basedOn w:val="DefaultParagraphFont"/>
+    <w:link w:val="Heading6"/>
     <w:uiPriority w:val="9"/>
     <w:semiHidden/>
     <w:rsid w:val="00F91686"/>
@@ -1340,10 +1354,10 @@
       <w:color w:val="595959" w:themeColor="text1" w:themeTint="A6"/>
     </w:rPr>
   </w:style>
-  <w:style w:type="character" w:customStyle="1" w:styleId="berschrift7Zchn">
-    <w:name w:val="Überschrift 7 Zchn"/>
-    <w:basedOn w:val="Absatz-Standardschriftart"/>
-    <w:link w:val="berschrift7"/>
+  <w:style w:type="character" w:customStyle="1" w:styleId="Heading7Char">
+    <w:name w:val="Heading 7 Char"/>
+    <w:basedOn w:val="DefaultParagraphFont"/>
+    <w:link w:val="Heading7"/>
     <w:uiPriority w:val="9"/>
     <w:semiHidden/>
     <w:rsid w:val="00F91686"/>
@@ -1352,10 +1366,10 @@
       <w:color w:val="595959" w:themeColor="text1" w:themeTint="A6"/>
     </w:rPr>
   </w:style>
-  <w:style w:type="character" w:customStyle="1" w:styleId="berschrift8Zchn">
-    <w:name w:val="Überschrift 8 Zchn"/>
-    <w:basedOn w:val="Absatz-Standardschriftart"/>
-    <w:link w:val="berschrift8"/>
+  <w:style w:type="character" w:customStyle="1" w:styleId="Heading8Char">
+    <w:name w:val="Heading 8 Char"/>
+    <w:basedOn w:val="DefaultParagraphFont"/>
+    <w:link w:val="Heading8"/>
     <w:uiPriority w:val="9"/>
     <w:semiHidden/>
     <w:rsid w:val="00F91686"/>
@@ -1366,10 +1380,10 @@
       <w:color w:val="272727" w:themeColor="text1" w:themeTint="D8"/>
     </w:rPr>
   </w:style>
-  <w:style w:type="character" w:customStyle="1" w:styleId="berschrift9Zchn">
-    <w:name w:val="Überschrift 9 Zchn"/>
-    <w:basedOn w:val="Absatz-Standardschriftart"/>
-    <w:link w:val="berschrift9"/>
+  <w:style w:type="character" w:customStyle="1" w:styleId="Heading9Char">
+    <w:name w:val="Heading 9 Char"/>
+    <w:basedOn w:val="DefaultParagraphFont"/>
+    <w:link w:val="Heading9"/>
     <w:uiPriority w:val="9"/>
     <w:semiHidden/>
     <w:rsid w:val="00F91686"/>
@@ -1378,11 +1392,11 @@
       <w:color w:val="272727" w:themeColor="text1" w:themeTint="D8"/>
     </w:rPr>
   </w:style>
-  <w:style w:type="paragraph" w:styleId="Titel">
+  <w:style w:type="paragraph" w:styleId="Title">
     <w:name w:val="Title"/>
-    <w:basedOn w:val="Standard"/>
-    <w:next w:val="Standard"/>
-    <w:link w:val="TitelZchn"/>
+    <w:basedOn w:val="Normal"/>
+    <w:next w:val="Normal"/>
+    <w:link w:val="TitleChar"/>
     <w:uiPriority w:val="10"/>
     <w:qFormat/>
     <w:rsid w:val="00F91686"/>
@@ -1398,10 +1412,10 @@
       <w:szCs w:val="56"/>
     </w:rPr>
   </w:style>
-  <w:style w:type="character" w:customStyle="1" w:styleId="TitelZchn">
-    <w:name w:val="Titel Zchn"/>
-    <w:basedOn w:val="Absatz-Standardschriftart"/>
-    <w:link w:val="Titel"/>
+  <w:style w:type="character" w:customStyle="1" w:styleId="TitleChar">
+    <w:name w:val="Title Char"/>
+    <w:basedOn w:val="DefaultParagraphFont"/>
+    <w:link w:val="Title"/>
     <w:uiPriority w:val="10"/>
     <w:rsid w:val="00F91686"/>
     <w:rPr>
@@ -1412,11 +1426,11 @@
       <w:szCs w:val="56"/>
     </w:rPr>
   </w:style>
-  <w:style w:type="paragraph" w:styleId="Untertitel">
+  <w:style w:type="paragraph" w:styleId="Subtitle">
     <w:name w:val="Subtitle"/>
-    <w:basedOn w:val="Standard"/>
-    <w:next w:val="Standard"/>
-    <w:link w:val="UntertitelZchn"/>
+    <w:basedOn w:val="Normal"/>
+    <w:next w:val="Normal"/>
+    <w:link w:val="SubtitleChar"/>
     <w:uiPriority w:val="11"/>
     <w:qFormat/>
     <w:rsid w:val="00F91686"/>
@@ -1433,10 +1447,10 @@
       <w:szCs w:val="28"/>
     </w:rPr>
   </w:style>
-  <w:style w:type="character" w:customStyle="1" w:styleId="UntertitelZchn">
-    <w:name w:val="Untertitel Zchn"/>
-    <w:basedOn w:val="Absatz-Standardschriftart"/>
-    <w:link w:val="Untertitel"/>
+  <w:style w:type="character" w:customStyle="1" w:styleId="SubtitleChar">
+    <w:name w:val="Subtitle Char"/>
+    <w:basedOn w:val="DefaultParagraphFont"/>
+    <w:link w:val="Subtitle"/>
     <w:uiPriority w:val="11"/>
     <w:rsid w:val="00F91686"/>
     <w:rPr>
@@ -1447,11 +1461,11 @@
       <w:szCs w:val="28"/>
     </w:rPr>
   </w:style>
-  <w:style w:type="paragraph" w:styleId="Zitat">
+  <w:style w:type="paragraph" w:styleId="Quote">
     <w:name w:val="Quote"/>
-    <w:basedOn w:val="Standard"/>
-    <w:next w:val="Standard"/>
-    <w:link w:val="ZitatZchn"/>
+    <w:basedOn w:val="Normal"/>
+    <w:next w:val="Normal"/>
+    <w:link w:val="QuoteChar"/>
     <w:uiPriority w:val="29"/>
     <w:qFormat/>
     <w:rsid w:val="00F91686"/>
@@ -1465,10 +1479,10 @@
       <w:color w:val="404040" w:themeColor="text1" w:themeTint="BF"/>
     </w:rPr>
   </w:style>
-  <w:style w:type="character" w:customStyle="1" w:styleId="ZitatZchn">
-    <w:name w:val="Zitat Zchn"/>
-    <w:basedOn w:val="Absatz-Standardschriftart"/>
-    <w:link w:val="Zitat"/>
+  <w:style w:type="character" w:customStyle="1" w:styleId="QuoteChar">
+    <w:name w:val="Quote Char"/>
+    <w:basedOn w:val="DefaultParagraphFont"/>
+    <w:link w:val="Quote"/>
     <w:uiPriority w:val="29"/>
     <w:rsid w:val="00F91686"/>
     <w:rPr>
@@ -1477,9 +1491,9 @@
       <w:color w:val="404040" w:themeColor="text1" w:themeTint="BF"/>
     </w:rPr>
   </w:style>
-  <w:style w:type="paragraph" w:styleId="Listenabsatz">
+  <w:style w:type="paragraph" w:styleId="ListParagraph">
     <w:name w:val="List Paragraph"/>
-    <w:basedOn w:val="Standard"/>
+    <w:basedOn w:val="Normal"/>
     <w:uiPriority w:val="34"/>
     <w:qFormat/>
     <w:rsid w:val="00F91686"/>
@@ -1488,9 +1502,9 @@
       <w:contextualSpacing/>
     </w:pPr>
   </w:style>
-  <w:style w:type="character" w:styleId="IntensiveHervorhebung">
+  <w:style w:type="character" w:styleId="IntenseEmphasis">
     <w:name w:val="Intense Emphasis"/>
-    <w:basedOn w:val="Absatz-Standardschriftart"/>
+    <w:basedOn w:val="DefaultParagraphFont"/>
     <w:uiPriority w:val="21"/>
     <w:qFormat/>
     <w:rsid w:val="00F91686"/>
@@ -1500,11 +1514,11 @@
       <w:color w:val="0F4761" w:themeColor="accent1" w:themeShade="BF"/>
     </w:rPr>
   </w:style>
-  <w:style w:type="paragraph" w:styleId="IntensivesZitat">
+  <w:style w:type="paragraph" w:styleId="IntenseQuote">
     <w:name w:val="Intense Quote"/>
-    <w:basedOn w:val="Standard"/>
-    <w:next w:val="Standard"/>
-    <w:link w:val="IntensivesZitatZchn"/>
+    <w:basedOn w:val="Normal"/>
+    <w:next w:val="Normal"/>
+    <w:link w:val="IntenseQuoteChar"/>
     <w:uiPriority w:val="30"/>
     <w:qFormat/>
     <w:rsid w:val="00F91686"/>
@@ -1523,10 +1537,10 @@
       <w:color w:val="0F4761" w:themeColor="accent1" w:themeShade="BF"/>
     </w:rPr>
   </w:style>
-  <w:style w:type="character" w:customStyle="1" w:styleId="IntensivesZitatZchn">
-    <w:name w:val="Intensives Zitat Zchn"/>
-    <w:basedOn w:val="Absatz-Standardschriftart"/>
-    <w:link w:val="IntensivesZitat"/>
+  <w:style w:type="character" w:customStyle="1" w:styleId="IntenseQuoteChar">
+    <w:name w:val="Intense Quote Char"/>
+    <w:basedOn w:val="DefaultParagraphFont"/>
+    <w:link w:val="IntenseQuote"/>
     <w:uiPriority w:val="30"/>
     <w:rsid w:val="00F91686"/>
     <w:rPr>
@@ -1535,9 +1549,9 @@
       <w:color w:val="0F4761" w:themeColor="accent1" w:themeShade="BF"/>
     </w:rPr>
   </w:style>
-  <w:style w:type="character" w:styleId="IntensiverVerweis">
+  <w:style w:type="character" w:styleId="IntenseReference">
     <w:name w:val="Intense Reference"/>
-    <w:basedOn w:val="Absatz-Standardschriftart"/>
+    <w:basedOn w:val="DefaultParagraphFont"/>
     <w:uiPriority w:val="32"/>
     <w:qFormat/>
     <w:rsid w:val="00F91686"/>
@@ -1549,10 +1563,10 @@
       <w:spacing w:val="5"/>
     </w:rPr>
   </w:style>
-  <w:style w:type="paragraph" w:styleId="Kopfzeile">
+  <w:style w:type="paragraph" w:styleId="Header">
     <w:name w:val="header"/>
-    <w:basedOn w:val="Standard"/>
-    <w:link w:val="KopfzeileZchn"/>
+    <w:basedOn w:val="Normal"/>
+    <w:link w:val="HeaderChar"/>
     <w:uiPriority w:val="99"/>
     <w:unhideWhenUsed/>
     <w:rsid w:val="006A690B"/>
@@ -1564,17 +1578,17 @@
       <w:spacing w:after="0" w:line="240" w:lineRule="auto"/>
     </w:pPr>
   </w:style>
-  <w:style w:type="character" w:customStyle="1" w:styleId="KopfzeileZchn">
-    <w:name w:val="Kopfzeile Zchn"/>
-    <w:basedOn w:val="Absatz-Standardschriftart"/>
-    <w:link w:val="Kopfzeile"/>
+  <w:style w:type="character" w:customStyle="1" w:styleId="HeaderChar">
+    <w:name w:val="Header Char"/>
+    <w:basedOn w:val="DefaultParagraphFont"/>
+    <w:link w:val="Header"/>
     <w:uiPriority w:val="99"/>
     <w:rsid w:val="006A690B"/>
   </w:style>
-  <w:style w:type="paragraph" w:styleId="Fuzeile">
+  <w:style w:type="paragraph" w:styleId="Footer">
     <w:name w:val="footer"/>
-    <w:basedOn w:val="Standard"/>
-    <w:link w:val="FuzeileZchn"/>
+    <w:basedOn w:val="Normal"/>
+    <w:link w:val="FooterChar"/>
     <w:uiPriority w:val="99"/>
     <w:unhideWhenUsed/>
     <w:rsid w:val="006A690B"/>
@@ -1586,10 +1600,10 @@
       <w:spacing w:after="0" w:line="240" w:lineRule="auto"/>
     </w:pPr>
   </w:style>
-  <w:style w:type="character" w:customStyle="1" w:styleId="FuzeileZchn">
-    <w:name w:val="Fußzeile Zchn"/>
-    <w:basedOn w:val="Absatz-Standardschriftart"/>
-    <w:link w:val="Fuzeile"/>
+  <w:style w:type="character" w:customStyle="1" w:styleId="FooterChar">
+    <w:name w:val="Footer Char"/>
+    <w:basedOn w:val="DefaultParagraphFont"/>
+    <w:link w:val="Footer"/>
     <w:uiPriority w:val="99"/>
     <w:rsid w:val="006A690B"/>
   </w:style>

</xml_diff>